<commit_message>
Move pending-offer deadline to 31 Dec 2026 and rebuild deliverables
- 04_data.sql: response deadline for open final-placement offers is now
  2026-12-31 (was 2026-12-15)
- Re-ran tests (91/91), re-recorded the demo, refreshed screenshots, and
  rebuilt the deck, report, guide, testing report and runbook with PDFs

Co-Authored-By: Claude Opus 5.5 <noreply@anthropic.com>
</commit_message>
<xml_diff>
--- a/deliverables/PlaceIQ_Testing_Report.docx
+++ b/deliverables/PlaceIQ_Testing_Report.docx
@@ -3206,7 +3206,7 @@
                 <w:sz w:val="19"/>
                 <w:szCs w:val="19"/>
               </w:rPr>
-              <w:t xml:space="preserve">2026-10-28 17:41:10</w:t>
+              <w:t xml:space="preserve">2026-10-28 18:25:22</w:t>
             </w:r>
           </w:p>
         </w:tc>
@@ -3337,7 +3337,7 @@
                 <w:sz w:val="21"/>
                 <w:szCs w:val="21"/>
               </w:rPr>
-              <w:t xml:space="preserve">91 of 91 tests passed, 0 failed, 0 skipped. Total test time 10.5 s (excluding database rebuilds). The suite was run twice consecutively with identical results.</w:t>
+              <w:t xml:space="preserve">91 of 91 tests passed, 0 failed, 0 skipped. Total test time 10.0 s (excluding database rebuilds). The suite was run twice consecutively with identical results.</w:t>
             </w:r>
           </w:p>
         </w:tc>
@@ -3674,7 +3674,7 @@
                 <w:sz w:val="19"/>
                 <w:szCs w:val="19"/>
               </w:rPr>
-              <w:t xml:space="preserve">92</w:t>
+              <w:t xml:space="preserve">102</w:t>
             </w:r>
           </w:p>
         </w:tc>
@@ -3819,7 +3819,7 @@
                 <w:sz w:val="19"/>
                 <w:szCs w:val="19"/>
               </w:rPr>
-              <w:t xml:space="preserve">306</w:t>
+              <w:t xml:space="preserve">247</w:t>
             </w:r>
           </w:p>
         </w:tc>
@@ -3964,7 +3964,7 @@
                 <w:sz w:val="19"/>
                 <w:szCs w:val="19"/>
               </w:rPr>
-              <w:t xml:space="preserve">335</w:t>
+              <w:t xml:space="preserve">326</w:t>
             </w:r>
           </w:p>
         </w:tc>
@@ -4109,7 +4109,7 @@
                 <w:sz w:val="19"/>
                 <w:szCs w:val="19"/>
               </w:rPr>
-              <w:t xml:space="preserve">252</w:t>
+              <w:t xml:space="preserve">271</w:t>
             </w:r>
           </w:p>
         </w:tc>
@@ -4254,7 +4254,7 @@
                 <w:sz w:val="19"/>
                 <w:szCs w:val="19"/>
               </w:rPr>
-              <w:t xml:space="preserve">1,346</w:t>
+              <w:t xml:space="preserve">1,199</w:t>
             </w:r>
           </w:p>
         </w:tc>
@@ -4399,7 +4399,7 @@
                 <w:sz w:val="19"/>
                 <w:szCs w:val="19"/>
               </w:rPr>
-              <w:t xml:space="preserve">2,000</w:t>
+              <w:t xml:space="preserve">1,819</w:t>
             </w:r>
           </w:p>
         </w:tc>
@@ -4544,7 +4544,7 @@
                 <w:sz w:val="19"/>
                 <w:szCs w:val="19"/>
               </w:rPr>
-              <w:t xml:space="preserve">2,964</w:t>
+              <w:t xml:space="preserve">3,019</w:t>
             </w:r>
           </w:p>
         </w:tc>
@@ -4689,7 +4689,7 @@
                 <w:sz w:val="19"/>
                 <w:szCs w:val="19"/>
               </w:rPr>
-              <w:t xml:space="preserve">331</w:t>
+              <w:t xml:space="preserve">340</w:t>
             </w:r>
           </w:p>
         </w:tc>
@@ -4834,7 +4834,7 @@
                 <w:sz w:val="19"/>
                 <w:szCs w:val="19"/>
               </w:rPr>
-              <w:t xml:space="preserve">2,880</w:t>
+              <w:t xml:space="preserve">2,677</w:t>
             </w:r>
           </w:p>
         </w:tc>
@@ -9400,7 +9400,7 @@
                 <w:sz w:val="16"/>
                 <w:szCs w:val="16"/>
               </w:rPr>
-              <w:t xml:space="preserve">8.2</w:t>
+              <w:t xml:space="preserve">8.4</w:t>
             </w:r>
           </w:p>
         </w:tc>
@@ -9560,7 +9560,7 @@
                 <w:sz w:val="16"/>
                 <w:szCs w:val="16"/>
               </w:rPr>
-              <w:t xml:space="preserve">4.1</w:t>
+              <w:t xml:space="preserve">6</w:t>
             </w:r>
           </w:p>
         </w:tc>
@@ -9720,7 +9720,7 @@
                 <w:sz w:val="16"/>
                 <w:szCs w:val="16"/>
               </w:rPr>
-              <w:t xml:space="preserve">6.4</w:t>
+              <w:t xml:space="preserve">7.6</w:t>
             </w:r>
           </w:p>
         </w:tc>
@@ -9865,7 +9865,7 @@
                 <w:sz w:val="16"/>
                 <w:szCs w:val="16"/>
               </w:rPr>
-              <w:t xml:space="preserve">4.3</w:t>
+              <w:t xml:space="preserve">5.7</w:t>
             </w:r>
           </w:p>
         </w:tc>
@@ -10010,7 +10010,7 @@
                 <w:sz w:val="16"/>
                 <w:szCs w:val="16"/>
               </w:rPr>
-              <w:t xml:space="preserve">6.7</w:t>
+              <w:t xml:space="preserve">4.5</w:t>
             </w:r>
           </w:p>
         </w:tc>
@@ -10155,7 +10155,7 @@
                 <w:sz w:val="16"/>
                 <w:szCs w:val="16"/>
               </w:rPr>
-              <w:t xml:space="preserve">27.9</w:t>
+              <w:t xml:space="preserve">36.4</w:t>
             </w:r>
           </w:p>
         </w:tc>
@@ -10300,7 +10300,7 @@
                 <w:sz w:val="16"/>
                 <w:szCs w:val="16"/>
               </w:rPr>
-              <w:t xml:space="preserve">7.2</w:t>
+              <w:t xml:space="preserve">9.4</w:t>
             </w:r>
           </w:p>
         </w:tc>
@@ -10445,7 +10445,7 @@
                 <w:sz w:val="16"/>
                 <w:szCs w:val="16"/>
               </w:rPr>
-              <w:t xml:space="preserve">7.4</w:t>
+              <w:t xml:space="preserve">7.8</w:t>
             </w:r>
           </w:p>
         </w:tc>
@@ -10590,7 +10590,7 @@
                 <w:sz w:val="16"/>
                 <w:szCs w:val="16"/>
               </w:rPr>
-              <w:t xml:space="preserve">9.4</w:t>
+              <w:t xml:space="preserve">6</w:t>
             </w:r>
           </w:p>
         </w:tc>
@@ -10918,7 +10918,7 @@
                 <w:sz w:val="16"/>
                 <w:szCs w:val="16"/>
               </w:rPr>
-              <w:t xml:space="preserve">17.6</w:t>
+              <w:t xml:space="preserve">14.1</w:t>
             </w:r>
           </w:p>
         </w:tc>
@@ -11063,7 +11063,7 @@
                 <w:sz w:val="16"/>
                 <w:szCs w:val="16"/>
               </w:rPr>
-              <w:t xml:space="preserve">5.5</w:t>
+              <w:t xml:space="preserve">4.6</w:t>
             </w:r>
           </w:p>
         </w:tc>
@@ -11208,7 +11208,7 @@
                 <w:sz w:val="16"/>
                 <w:szCs w:val="16"/>
               </w:rPr>
-              <w:t xml:space="preserve">16.8</w:t>
+              <w:t xml:space="preserve">13.9</w:t>
             </w:r>
           </w:p>
         </w:tc>
@@ -11368,7 +11368,7 @@
                 <w:sz w:val="16"/>
                 <w:szCs w:val="16"/>
               </w:rPr>
-              <w:t xml:space="preserve">7.8</w:t>
+              <w:t xml:space="preserve">9.8</w:t>
             </w:r>
           </w:p>
         </w:tc>
@@ -11528,7 +11528,7 @@
                 <w:sz w:val="16"/>
                 <w:szCs w:val="16"/>
               </w:rPr>
-              <w:t xml:space="preserve">16.3</w:t>
+              <w:t xml:space="preserve">17.1</w:t>
             </w:r>
           </w:p>
         </w:tc>
@@ -11673,7 +11673,7 @@
                 <w:sz w:val="16"/>
                 <w:szCs w:val="16"/>
               </w:rPr>
-              <w:t xml:space="preserve">7.7</w:t>
+              <w:t xml:space="preserve">8.7</w:t>
             </w:r>
           </w:p>
         </w:tc>
@@ -11818,7 +11818,7 @@
                 <w:sz w:val="16"/>
                 <w:szCs w:val="16"/>
               </w:rPr>
-              <w:t xml:space="preserve">20.7</w:t>
+              <w:t xml:space="preserve">23.9</w:t>
             </w:r>
           </w:p>
         </w:tc>
@@ -11963,7 +11963,7 @@
                 <w:sz w:val="16"/>
                 <w:szCs w:val="16"/>
               </w:rPr>
-              <w:t xml:space="preserve">16</w:t>
+              <w:t xml:space="preserve">17.9</w:t>
             </w:r>
           </w:p>
         </w:tc>
@@ -12108,7 +12108,7 @@
                 <w:sz w:val="16"/>
                 <w:szCs w:val="16"/>
               </w:rPr>
-              <w:t xml:space="preserve">10.3</w:t>
+              <w:t xml:space="preserve">10.8</w:t>
             </w:r>
           </w:p>
         </w:tc>
@@ -12253,7 +12253,7 @@
                 <w:sz w:val="16"/>
                 <w:szCs w:val="16"/>
               </w:rPr>
-              <w:t xml:space="preserve">11.2</w:t>
+              <w:t xml:space="preserve">13.2</w:t>
             </w:r>
           </w:p>
         </w:tc>
@@ -12398,7 +12398,7 @@
                 <w:sz w:val="16"/>
                 <w:szCs w:val="16"/>
               </w:rPr>
-              <w:t xml:space="preserve">4.6</w:t>
+              <w:t xml:space="preserve">5.3</w:t>
             </w:r>
           </w:p>
         </w:tc>
@@ -12543,7 +12543,7 @@
                 <w:sz w:val="16"/>
                 <w:szCs w:val="16"/>
               </w:rPr>
-              <w:t xml:space="preserve">13.3</w:t>
+              <w:t xml:space="preserve">9.8</w:t>
             </w:r>
           </w:p>
         </w:tc>
@@ -12688,7 +12688,7 @@
                 <w:sz w:val="16"/>
                 <w:szCs w:val="16"/>
               </w:rPr>
-              <w:t xml:space="preserve">12.6</w:t>
+              <w:t xml:space="preserve">8.3</w:t>
             </w:r>
           </w:p>
         </w:tc>
@@ -12833,7 +12833,7 @@
                 <w:sz w:val="16"/>
                 <w:szCs w:val="16"/>
               </w:rPr>
-              <w:t xml:space="preserve">8.4</w:t>
+              <w:t xml:space="preserve">6</w:t>
             </w:r>
           </w:p>
         </w:tc>
@@ -12978,7 +12978,7 @@
                 <w:sz w:val="16"/>
                 <w:szCs w:val="16"/>
               </w:rPr>
-              <w:t xml:space="preserve">27.4</w:t>
+              <w:t xml:space="preserve">28.8</w:t>
             </w:r>
           </w:p>
         </w:tc>
@@ -13123,7 +13123,7 @@
                 <w:sz w:val="16"/>
                 <w:szCs w:val="16"/>
               </w:rPr>
-              <w:t xml:space="preserve">52.2</w:t>
+              <w:t xml:space="preserve">23</w:t>
             </w:r>
           </w:p>
         </w:tc>
@@ -13268,7 +13268,7 @@
                 <w:sz w:val="16"/>
                 <w:szCs w:val="16"/>
               </w:rPr>
-              <w:t xml:space="preserve">34</w:t>
+              <w:t xml:space="preserve">16.3</w:t>
             </w:r>
           </w:p>
         </w:tc>
@@ -13413,7 +13413,7 @@
                 <w:sz w:val="16"/>
                 <w:szCs w:val="16"/>
               </w:rPr>
-              <w:t xml:space="preserve">10.7</w:t>
+              <w:t xml:space="preserve">7.1</w:t>
             </w:r>
           </w:p>
         </w:tc>
@@ -13558,7 +13558,7 @@
                 <w:sz w:val="16"/>
                 <w:szCs w:val="16"/>
               </w:rPr>
-              <w:t xml:space="preserve">6</w:t>
+              <w:t xml:space="preserve">3.9</w:t>
             </w:r>
           </w:p>
         </w:tc>
@@ -13703,7 +13703,7 @@
                 <w:sz w:val="16"/>
                 <w:szCs w:val="16"/>
               </w:rPr>
-              <w:t xml:space="preserve">7.3</w:t>
+              <w:t xml:space="preserve">4.5</w:t>
             </w:r>
           </w:p>
         </w:tc>
@@ -14031,7 +14031,7 @@
                 <w:sz w:val="16"/>
                 <w:szCs w:val="16"/>
               </w:rPr>
-              <w:t xml:space="preserve">10.2</w:t>
+              <w:t xml:space="preserve">10.7</w:t>
             </w:r>
           </w:p>
         </w:tc>
@@ -14176,7 +14176,7 @@
                 <w:sz w:val="16"/>
                 <w:szCs w:val="16"/>
               </w:rPr>
-              <w:t xml:space="preserve">9.4</w:t>
+              <w:t xml:space="preserve">9.3</w:t>
             </w:r>
           </w:p>
         </w:tc>
@@ -14321,7 +14321,7 @@
                 <w:sz w:val="16"/>
                 <w:szCs w:val="16"/>
               </w:rPr>
-              <w:t xml:space="preserve">11.1</w:t>
+              <w:t xml:space="preserve">12.2</w:t>
             </w:r>
           </w:p>
         </w:tc>
@@ -14466,7 +14466,7 @@
                 <w:sz w:val="16"/>
                 <w:szCs w:val="16"/>
               </w:rPr>
-              <w:t xml:space="preserve">24.8</w:t>
+              <w:t xml:space="preserve">19.2</w:t>
             </w:r>
           </w:p>
         </w:tc>
@@ -14611,7 +14611,7 @@
                 <w:sz w:val="16"/>
                 <w:szCs w:val="16"/>
               </w:rPr>
-              <w:t xml:space="preserve">21.9</w:t>
+              <w:t xml:space="preserve">19.1</w:t>
             </w:r>
           </w:p>
         </w:tc>
@@ -14756,7 +14756,7 @@
                 <w:sz w:val="16"/>
                 <w:szCs w:val="16"/>
               </w:rPr>
-              <w:t xml:space="preserve">15.2</w:t>
+              <w:t xml:space="preserve">13.9</w:t>
             </w:r>
           </w:p>
         </w:tc>
@@ -14901,7 +14901,7 @@
                 <w:sz w:val="16"/>
                 <w:szCs w:val="16"/>
               </w:rPr>
-              <w:t xml:space="preserve">21.8</w:t>
+              <w:t xml:space="preserve">20.8</w:t>
             </w:r>
           </w:p>
         </w:tc>
@@ -15046,7 +15046,7 @@
                 <w:sz w:val="16"/>
                 <w:szCs w:val="16"/>
               </w:rPr>
-              <w:t xml:space="preserve">6.5</w:t>
+              <w:t xml:space="preserve">6.8</w:t>
             </w:r>
           </w:p>
         </w:tc>
@@ -15191,7 +15191,7 @@
                 <w:sz w:val="16"/>
                 <w:szCs w:val="16"/>
               </w:rPr>
-              <w:t xml:space="preserve">18.9</w:t>
+              <w:t xml:space="preserve">18.5</w:t>
             </w:r>
           </w:p>
         </w:tc>
@@ -15351,7 +15351,7 @@
                 <w:sz w:val="16"/>
                 <w:szCs w:val="16"/>
               </w:rPr>
-              <w:t xml:space="preserve">39.5</w:t>
+              <w:t xml:space="preserve">44.6</w:t>
             </w:r>
           </w:p>
         </w:tc>
@@ -15496,7 +15496,7 @@
                 <w:sz w:val="16"/>
                 <w:szCs w:val="16"/>
               </w:rPr>
-              <w:t xml:space="preserve">52.7</w:t>
+              <w:t xml:space="preserve">40.8</w:t>
             </w:r>
           </w:p>
         </w:tc>
@@ -15641,7 +15641,7 @@
                 <w:sz w:val="16"/>
                 <w:szCs w:val="16"/>
               </w:rPr>
-              <w:t xml:space="preserve">29.4</w:t>
+              <w:t xml:space="preserve">35.2</w:t>
             </w:r>
           </w:p>
         </w:tc>
@@ -15786,7 +15786,7 @@
                 <w:sz w:val="16"/>
                 <w:szCs w:val="16"/>
               </w:rPr>
-              <w:t xml:space="preserve">33.3</w:t>
+              <w:t xml:space="preserve">36.1</w:t>
             </w:r>
           </w:p>
         </w:tc>
@@ -15931,7 +15931,7 @@
                 <w:sz w:val="16"/>
                 <w:szCs w:val="16"/>
               </w:rPr>
-              <w:t xml:space="preserve">13.5</w:t>
+              <w:t xml:space="preserve">11.6</w:t>
             </w:r>
           </w:p>
         </w:tc>
@@ -16076,7 +16076,7 @@
                 <w:sz w:val="16"/>
                 <w:szCs w:val="16"/>
               </w:rPr>
-              <w:t xml:space="preserve">20.8</w:t>
+              <w:t xml:space="preserve">20.4</w:t>
             </w:r>
           </w:p>
         </w:tc>
@@ -16221,7 +16221,7 @@
                 <w:sz w:val="16"/>
                 <w:szCs w:val="16"/>
               </w:rPr>
-              <w:t xml:space="preserve">5.7</w:t>
+              <w:t xml:space="preserve">7.1</w:t>
             </w:r>
           </w:p>
         </w:tc>
@@ -16694,7 +16694,7 @@
                 <w:sz w:val="16"/>
                 <w:szCs w:val="16"/>
               </w:rPr>
-              <w:t xml:space="preserve">48.5</w:t>
+              <w:t xml:space="preserve">51</w:t>
             </w:r>
           </w:p>
         </w:tc>
@@ -16839,7 +16839,7 @@
                 <w:sz w:val="16"/>
                 <w:szCs w:val="16"/>
               </w:rPr>
-              <w:t xml:space="preserve">12.6</w:t>
+              <w:t xml:space="preserve">13.5</w:t>
             </w:r>
           </w:p>
         </w:tc>
@@ -16984,7 +16984,7 @@
                 <w:sz w:val="16"/>
                 <w:szCs w:val="16"/>
               </w:rPr>
-              <w:t xml:space="preserve">24.9</w:t>
+              <w:t xml:space="preserve">27.4</w:t>
             </w:r>
           </w:p>
         </w:tc>
@@ -17129,7 +17129,7 @@
                 <w:sz w:val="16"/>
                 <w:szCs w:val="16"/>
               </w:rPr>
-              <w:t xml:space="preserve">18.5</w:t>
+              <w:t xml:space="preserve">23.7</w:t>
             </w:r>
           </w:p>
         </w:tc>
@@ -17289,7 +17289,7 @@
                 <w:sz w:val="16"/>
                 <w:szCs w:val="16"/>
               </w:rPr>
-              <w:t xml:space="preserve">39.9</w:t>
+              <w:t xml:space="preserve">55.3</w:t>
             </w:r>
           </w:p>
         </w:tc>
@@ -17434,7 +17434,7 @@
                 <w:sz w:val="16"/>
                 <w:szCs w:val="16"/>
               </w:rPr>
-              <w:t xml:space="preserve">33.1</w:t>
+              <w:t xml:space="preserve">31</w:t>
             </w:r>
           </w:p>
         </w:tc>
@@ -17579,7 +17579,7 @@
                 <w:sz w:val="16"/>
                 <w:szCs w:val="16"/>
               </w:rPr>
-              <w:t xml:space="preserve">17.5</w:t>
+              <w:t xml:space="preserve">15.8</w:t>
             </w:r>
           </w:p>
         </w:tc>
@@ -17724,7 +17724,7 @@
                 <w:sz w:val="16"/>
                 <w:szCs w:val="16"/>
               </w:rPr>
-              <w:t xml:space="preserve">56.3</w:t>
+              <w:t xml:space="preserve">53.1</w:t>
             </w:r>
           </w:p>
         </w:tc>
@@ -18052,7 +18052,7 @@
                 <w:sz w:val="16"/>
                 <w:szCs w:val="16"/>
               </w:rPr>
-              <w:t xml:space="preserve">33.7</w:t>
+              <w:t xml:space="preserve">18.6</w:t>
             </w:r>
           </w:p>
         </w:tc>
@@ -18197,7 +18197,7 @@
                 <w:sz w:val="16"/>
                 <w:szCs w:val="16"/>
               </w:rPr>
-              <w:t xml:space="preserve">1255.6</w:t>
+              <w:t xml:space="preserve">1117.1</w:t>
             </w:r>
           </w:p>
         </w:tc>
@@ -18342,7 +18342,7 @@
                 <w:sz w:val="16"/>
                 <w:szCs w:val="16"/>
               </w:rPr>
-              <w:t xml:space="preserve">9.5</w:t>
+              <w:t xml:space="preserve">7.4</w:t>
             </w:r>
           </w:p>
         </w:tc>
@@ -18487,7 +18487,7 @@
                 <w:sz w:val="16"/>
                 <w:szCs w:val="16"/>
               </w:rPr>
-              <w:t xml:space="preserve">14.6</w:t>
+              <w:t xml:space="preserve">12.3</w:t>
             </w:r>
           </w:p>
         </w:tc>
@@ -18632,7 +18632,7 @@
                 <w:sz w:val="16"/>
                 <w:szCs w:val="16"/>
               </w:rPr>
-              <w:t xml:space="preserve">10</w:t>
+              <w:t xml:space="preserve">12.3</w:t>
             </w:r>
           </w:p>
         </w:tc>
@@ -18777,7 +18777,7 @@
                 <w:sz w:val="16"/>
                 <w:szCs w:val="16"/>
               </w:rPr>
-              <w:t xml:space="preserve">6.1</w:t>
+              <w:t xml:space="preserve">9.6</w:t>
             </w:r>
           </w:p>
         </w:tc>
@@ -18922,7 +18922,7 @@
                 <w:sz w:val="16"/>
                 <w:szCs w:val="16"/>
               </w:rPr>
-              <w:t xml:space="preserve">6.2</w:t>
+              <w:t xml:space="preserve">8.9</w:t>
             </w:r>
           </w:p>
         </w:tc>
@@ -19067,7 +19067,7 @@
                 <w:sz w:val="16"/>
                 <w:szCs w:val="16"/>
               </w:rPr>
-              <w:t xml:space="preserve">5.7</w:t>
+              <w:t xml:space="preserve">7.8</w:t>
             </w:r>
           </w:p>
         </w:tc>
@@ -19212,7 +19212,7 @@
                 <w:sz w:val="16"/>
                 <w:szCs w:val="16"/>
               </w:rPr>
-              <w:t xml:space="preserve">4.6</w:t>
+              <w:t xml:space="preserve">5</w:t>
             </w:r>
           </w:p>
         </w:tc>
@@ -19540,7 +19540,7 @@
                 <w:sz w:val="16"/>
                 <w:szCs w:val="16"/>
               </w:rPr>
-              <w:t xml:space="preserve">45.1</w:t>
+              <w:t xml:space="preserve">32.9</w:t>
             </w:r>
           </w:p>
         </w:tc>
@@ -19685,7 +19685,7 @@
                 <w:sz w:val="16"/>
                 <w:szCs w:val="16"/>
               </w:rPr>
-              <w:t xml:space="preserve">901.2</w:t>
+              <w:t xml:space="preserve">861.8</w:t>
             </w:r>
           </w:p>
         </w:tc>
@@ -19845,7 +19845,7 @@
                 <w:sz w:val="16"/>
                 <w:szCs w:val="16"/>
               </w:rPr>
-              <w:t xml:space="preserve">948</w:t>
+              <w:t xml:space="preserve">817.4</w:t>
             </w:r>
           </w:p>
         </w:tc>
@@ -19990,7 +19990,7 @@
                 <w:sz w:val="16"/>
                 <w:szCs w:val="16"/>
               </w:rPr>
-              <w:t xml:space="preserve">105.5</w:t>
+              <w:t xml:space="preserve">106.4</w:t>
             </w:r>
           </w:p>
         </w:tc>
@@ -20318,7 +20318,7 @@
                 <w:sz w:val="16"/>
                 <w:szCs w:val="16"/>
               </w:rPr>
-              <w:t xml:space="preserve">1093.5</w:t>
+              <w:t xml:space="preserve">1065</w:t>
             </w:r>
           </w:p>
         </w:tc>
@@ -20463,7 +20463,7 @@
                 <w:sz w:val="16"/>
                 <w:szCs w:val="16"/>
               </w:rPr>
-              <w:t xml:space="preserve">981.2</w:t>
+              <w:t xml:space="preserve">988.2</w:t>
             </w:r>
           </w:p>
         </w:tc>
@@ -20623,7 +20623,7 @@
                 <w:sz w:val="16"/>
                 <w:szCs w:val="16"/>
               </w:rPr>
-              <w:t xml:space="preserve">888.8</w:t>
+              <w:t xml:space="preserve">965.9</w:t>
             </w:r>
           </w:p>
         </w:tc>
@@ -20951,7 +20951,7 @@
                 <w:sz w:val="16"/>
                 <w:szCs w:val="16"/>
               </w:rPr>
-              <w:t xml:space="preserve">12.2</w:t>
+              <w:t xml:space="preserve">6.4</w:t>
             </w:r>
           </w:p>
         </w:tc>
@@ -21096,7 +21096,7 @@
                 <w:sz w:val="16"/>
                 <w:szCs w:val="16"/>
               </w:rPr>
-              <w:t xml:space="preserve">6.5</w:t>
+              <w:t xml:space="preserve">5.8</w:t>
             </w:r>
           </w:p>
         </w:tc>
@@ -21241,7 +21241,7 @@
                 <w:sz w:val="16"/>
                 <w:szCs w:val="16"/>
               </w:rPr>
-              <w:t xml:space="preserve">18.7</w:t>
+              <w:t xml:space="preserve">9.6</w:t>
             </w:r>
           </w:p>
         </w:tc>
@@ -21386,7 +21386,7 @@
                 <w:sz w:val="16"/>
                 <w:szCs w:val="16"/>
               </w:rPr>
-              <w:t xml:space="preserve">3.6</w:t>
+              <w:t xml:space="preserve">1.6</w:t>
             </w:r>
           </w:p>
         </w:tc>
@@ -21531,7 +21531,7 @@
                 <w:sz w:val="16"/>
                 <w:szCs w:val="16"/>
               </w:rPr>
-              <w:t xml:space="preserve">73.2</w:t>
+              <w:t xml:space="preserve">52.2</w:t>
             </w:r>
           </w:p>
         </w:tc>
@@ -21676,7 +21676,7 @@
                 <w:sz w:val="16"/>
                 <w:szCs w:val="16"/>
               </w:rPr>
-              <w:t xml:space="preserve">68.3</w:t>
+              <w:t xml:space="preserve">47.2</w:t>
             </w:r>
           </w:p>
         </w:tc>
@@ -21821,7 +21821,7 @@
                 <w:sz w:val="16"/>
                 <w:szCs w:val="16"/>
               </w:rPr>
-              <w:t xml:space="preserve">73.3</w:t>
+              <w:t xml:space="preserve">48.2</w:t>
             </w:r>
           </w:p>
         </w:tc>
@@ -21966,7 +21966,7 @@
                 <w:sz w:val="16"/>
                 <w:szCs w:val="16"/>
               </w:rPr>
-              <w:t xml:space="preserve">68.4</w:t>
+              <w:t xml:space="preserve">160.6</w:t>
             </w:r>
           </w:p>
         </w:tc>
@@ -22111,7 +22111,7 @@
                 <w:sz w:val="16"/>
                 <w:szCs w:val="16"/>
               </w:rPr>
-              <w:t xml:space="preserve">6.9</w:t>
+              <w:t xml:space="preserve">8.1</w:t>
             </w:r>
           </w:p>
         </w:tc>
@@ -22439,7 +22439,7 @@
                 <w:sz w:val="16"/>
                 <w:szCs w:val="16"/>
               </w:rPr>
-              <w:t xml:space="preserve">91.1</w:t>
+              <w:t xml:space="preserve">112.3</w:t>
             </w:r>
           </w:p>
         </w:tc>
@@ -22584,7 +22584,7 @@
                 <w:sz w:val="16"/>
                 <w:szCs w:val="16"/>
               </w:rPr>
-              <w:t xml:space="preserve">99.7</w:t>
+              <w:t xml:space="preserve">90.3</w:t>
             </w:r>
           </w:p>
         </w:tc>
@@ -22729,7 +22729,7 @@
                 <w:sz w:val="16"/>
                 <w:szCs w:val="16"/>
               </w:rPr>
-              <w:t xml:space="preserve">104.7</w:t>
+              <w:t xml:space="preserve">70.1</w:t>
             </w:r>
           </w:p>
         </w:tc>
@@ -22874,7 +22874,7 @@
                 <w:sz w:val="16"/>
                 <w:szCs w:val="16"/>
               </w:rPr>
-              <w:t xml:space="preserve">62.8</w:t>
+              <w:t xml:space="preserve">51.1</w:t>
             </w:r>
           </w:p>
         </w:tc>
@@ -23019,7 +23019,7 @@
                 <w:sz w:val="16"/>
                 <w:szCs w:val="16"/>
               </w:rPr>
-              <w:t xml:space="preserve">173.8</w:t>
+              <w:t xml:space="preserve">152</w:t>
             </w:r>
           </w:p>
         </w:tc>
@@ -23164,7 +23164,7 @@
                 <w:sz w:val="16"/>
                 <w:szCs w:val="16"/>
               </w:rPr>
-              <w:t xml:space="preserve">409.7</w:t>
+              <w:t xml:space="preserve">380.5</w:t>
             </w:r>
           </w:p>
         </w:tc>
@@ -23309,7 +23309,7 @@
                 <w:sz w:val="16"/>
                 <w:szCs w:val="16"/>
               </w:rPr>
-              <w:t xml:space="preserve">71.9</w:t>
+              <w:t xml:space="preserve">61.3</w:t>
             </w:r>
           </w:p>
         </w:tc>
@@ -23454,7 +23454,7 @@
                 <w:sz w:val="16"/>
                 <w:szCs w:val="16"/>
               </w:rPr>
-              <w:t xml:space="preserve">459.7</w:t>
+              <w:t xml:space="preserve">243.1</w:t>
             </w:r>
           </w:p>
         </w:tc>
@@ -23599,7 +23599,7 @@
                 <w:sz w:val="16"/>
                 <w:szCs w:val="16"/>
               </w:rPr>
-              <w:t xml:space="preserve">191.6</w:t>
+              <w:t xml:space="preserve">144.5</w:t>
             </w:r>
           </w:p>
         </w:tc>
@@ -23744,7 +23744,7 @@
                 <w:sz w:val="16"/>
                 <w:szCs w:val="16"/>
               </w:rPr>
-              <w:t xml:space="preserve">101.5</w:t>
+              <w:t xml:space="preserve">144.1</w:t>
             </w:r>
           </w:p>
         </w:tc>
@@ -23889,7 +23889,7 @@
                 <w:sz w:val="16"/>
                 <w:szCs w:val="16"/>
               </w:rPr>
-              <w:t xml:space="preserve">1113.5</w:t>
+              <w:t xml:space="preserve">1228.1</w:t>
             </w:r>
           </w:p>
         </w:tc>
@@ -24155,7 +24155,7 @@
                 <w:sz w:val="19"/>
                 <w:szCs w:val="19"/>
               </w:rPr>
-              <w:t xml:space="preserve">62.609 ms</w:t>
+              <w:t xml:space="preserve">62.654 ms</w:t>
             </w:r>
           </w:p>
         </w:tc>
@@ -24216,7 +24216,7 @@
                 <w:sz w:val="19"/>
                 <w:szCs w:val="19"/>
               </w:rPr>
-              <w:t xml:space="preserve">0.041 ms (1,527× faster)</w:t>
+              <w:t xml:space="preserve">0.029 ms (2,160× faster)</w:t>
             </w:r>
           </w:p>
         </w:tc>
@@ -24277,7 +24277,7 @@
                 <w:sz w:val="19"/>
                 <w:szCs w:val="19"/>
               </w:rPr>
-              <w:t xml:space="preserve">0.017 ms</w:t>
+              <w:t xml:space="preserve">0.021 ms</w:t>
             </w:r>
           </w:p>
         </w:tc>

</xml_diff>